<commit_message>
Hasta consigna 7 tp3
</commit_message>
<xml_diff>
--- a/TP3/Program_TP3_Grupo2.docx
+++ b/TP3/Program_TP3_Grupo2.docx
@@ -341,10 +341,1656 @@
           <w:szCs w:val="28"/>
         </w:rPr>
       </w:pPr>
+      <w:r>
+        <w:rPr>
+          <w:sz w:val="28"/>
+          <w:szCs w:val="28"/>
+        </w:rPr>
+        <w:lastRenderedPageBreak/>
+        <w:t>PARTE A</w:t>
+      </w:r>
+    </w:p>
+    <w:p>
+      <w:pPr>
+        <w:rPr>
+          <w:sz w:val="28"/>
+          <w:szCs w:val="28"/>
+        </w:rPr>
+      </w:pPr>
+      <w:r>
+        <w:rPr>
+          <w:sz w:val="28"/>
+          <w:szCs w:val="28"/>
+        </w:rPr>
+        <w:t>Consigna 1</w:t>
+      </w:r>
+    </w:p>
+    <w:p>
+      <w:pPr>
+        <w:jc w:val="both"/>
+        <w:rPr>
+          <w:sz w:val="28"/>
+          <w:szCs w:val="28"/>
+        </w:rPr>
+      </w:pPr>
+      <w:r>
+        <w:rPr>
+          <w:sz w:val="28"/>
+          <w:szCs w:val="28"/>
+        </w:rPr>
+        <w:t>Las medias de las variables seleccionadas son muy similares entre la base de entrenamiento y la de testeo, lo cual confirma que la partición aleatoria con semilla reproducible mantiene la representatividad y no introduce sesgos sistemáticos entre ambas muestras.</w:t>
+      </w:r>
+    </w:p>
+    <w:p>
+      <w:pPr>
+        <w:spacing w:after="0" w:line="240" w:lineRule="auto"/>
+        <w:rPr>
+          <w:rFonts w:ascii="Consolas" w:eastAsia="Times New Roman" w:hAnsi="Consolas" w:cs="Times New Roman"/>
+          <w:color w:val="000000" w:themeColor="text1"/>
+          <w:kern w:val="0"/>
+          <w:sz w:val="21"/>
+          <w:szCs w:val="21"/>
+          <w:lang w:eastAsia="es-AR"/>
+          <w14:ligatures w14:val="none"/>
+        </w:rPr>
+      </w:pPr>
+      <w:r>
+        <w:rPr>
+          <w:rFonts w:ascii="Consolas" w:eastAsia="Times New Roman" w:hAnsi="Consolas" w:cs="Times New Roman"/>
+          <w:color w:val="000000" w:themeColor="text1"/>
+          <w:kern w:val="0"/>
+          <w:sz w:val="21"/>
+          <w:szCs w:val="21"/>
+          <w:lang w:eastAsia="es-AR"/>
+          <w14:ligatures w14:val="none"/>
+        </w:rPr>
+        <w:t xml:space="preserve">                  </w:t>
+      </w:r>
+      <w:proofErr w:type="spellStart"/>
+      <w:r>
+        <w:rPr>
+          <w:rFonts w:ascii="Consolas" w:eastAsia="Times New Roman" w:hAnsi="Consolas" w:cs="Times New Roman"/>
+          <w:color w:val="000000" w:themeColor="text1"/>
+          <w:kern w:val="0"/>
+          <w:sz w:val="21"/>
+          <w:szCs w:val="21"/>
+          <w:lang w:eastAsia="es-AR"/>
+          <w14:ligatures w14:val="none"/>
+        </w:rPr>
+        <w:t>Media_Train</w:t>
+      </w:r>
+      <w:proofErr w:type="spellEnd"/>
+      <w:r>
+        <w:rPr>
+          <w:rFonts w:ascii="Consolas" w:eastAsia="Times New Roman" w:hAnsi="Consolas" w:cs="Times New Roman"/>
+          <w:color w:val="000000" w:themeColor="text1"/>
+          <w:kern w:val="0"/>
+          <w:sz w:val="21"/>
+          <w:szCs w:val="21"/>
+          <w:lang w:eastAsia="es-AR"/>
+          <w14:ligatures w14:val="none"/>
+        </w:rPr>
+        <w:t xml:space="preserve">     </w:t>
+      </w:r>
+      <w:proofErr w:type="spellStart"/>
+      <w:r>
+        <w:rPr>
+          <w:rFonts w:ascii="Consolas" w:eastAsia="Times New Roman" w:hAnsi="Consolas" w:cs="Times New Roman"/>
+          <w:color w:val="000000" w:themeColor="text1"/>
+          <w:kern w:val="0"/>
+          <w:sz w:val="21"/>
+          <w:szCs w:val="21"/>
+          <w:lang w:eastAsia="es-AR"/>
+          <w14:ligatures w14:val="none"/>
+        </w:rPr>
+        <w:t>Media_Test</w:t>
+      </w:r>
+      <w:proofErr w:type="spellEnd"/>
+      <w:r>
+        <w:rPr>
+          <w:rFonts w:ascii="Consolas" w:eastAsia="Times New Roman" w:hAnsi="Consolas" w:cs="Times New Roman"/>
+          <w:color w:val="000000" w:themeColor="text1"/>
+          <w:kern w:val="0"/>
+          <w:sz w:val="21"/>
+          <w:szCs w:val="21"/>
+          <w:lang w:eastAsia="es-AR"/>
+          <w14:ligatures w14:val="none"/>
+        </w:rPr>
+        <w:t xml:space="preserve">    Diferencia</w:t>
+      </w:r>
+    </w:p>
+    <w:p>
+      <w:pPr>
+        <w:spacing w:after="0" w:line="240" w:lineRule="auto"/>
+        <w:rPr>
+          <w:rFonts w:ascii="Consolas" w:eastAsia="Times New Roman" w:hAnsi="Consolas" w:cs="Times New Roman"/>
+          <w:color w:val="000000" w:themeColor="text1"/>
+          <w:kern w:val="0"/>
+          <w:sz w:val="21"/>
+          <w:szCs w:val="21"/>
+          <w:lang w:eastAsia="es-AR"/>
+          <w14:ligatures w14:val="none"/>
+        </w:rPr>
+      </w:pPr>
+      <w:r>
+        <w:rPr>
+          <w:rFonts w:ascii="Consolas" w:eastAsia="Times New Roman" w:hAnsi="Consolas" w:cs="Times New Roman"/>
+          <w:color w:val="000000" w:themeColor="text1"/>
+          <w:kern w:val="0"/>
+          <w:sz w:val="21"/>
+          <w:szCs w:val="21"/>
+          <w:lang w:eastAsia="es-AR"/>
+          <w14:ligatures w14:val="none"/>
+        </w:rPr>
+        <w:t>ch06                32.337175      32.793398     -0.456223</w:t>
+      </w:r>
+    </w:p>
+    <w:p>
+      <w:pPr>
+        <w:spacing w:after="0" w:line="240" w:lineRule="auto"/>
+        <w:rPr>
+          <w:rFonts w:ascii="Consolas" w:eastAsia="Times New Roman" w:hAnsi="Consolas" w:cs="Times New Roman"/>
+          <w:color w:val="000000" w:themeColor="text1"/>
+          <w:kern w:val="0"/>
+          <w:sz w:val="21"/>
+          <w:szCs w:val="21"/>
+          <w:lang w:eastAsia="es-AR"/>
+          <w14:ligatures w14:val="none"/>
+        </w:rPr>
+      </w:pPr>
+      <w:proofErr w:type="spellStart"/>
+      <w:r>
+        <w:rPr>
+          <w:rFonts w:ascii="Consolas" w:eastAsia="Times New Roman" w:hAnsi="Consolas" w:cs="Times New Roman"/>
+          <w:color w:val="000000" w:themeColor="text1"/>
+          <w:kern w:val="0"/>
+          <w:sz w:val="21"/>
+          <w:szCs w:val="21"/>
+          <w:lang w:eastAsia="es-AR"/>
+          <w14:ligatures w14:val="none"/>
+        </w:rPr>
+        <w:t>nivel_ed</w:t>
+      </w:r>
+      <w:proofErr w:type="spellEnd"/>
+      <w:r>
+        <w:rPr>
+          <w:rFonts w:ascii="Consolas" w:eastAsia="Times New Roman" w:hAnsi="Consolas" w:cs="Times New Roman"/>
+          <w:color w:val="000000" w:themeColor="text1"/>
+          <w:kern w:val="0"/>
+          <w:sz w:val="21"/>
+          <w:szCs w:val="21"/>
+          <w:lang w:eastAsia="es-AR"/>
+          <w14:ligatures w14:val="none"/>
+        </w:rPr>
+        <w:t xml:space="preserve">             3.615611       3.629636     -0.014026</w:t>
+      </w:r>
+    </w:p>
+    <w:p>
+      <w:pPr>
+        <w:spacing w:after="0" w:line="240" w:lineRule="auto"/>
+        <w:rPr>
+          <w:rFonts w:ascii="Consolas" w:eastAsia="Times New Roman" w:hAnsi="Consolas" w:cs="Times New Roman"/>
+          <w:color w:val="000000" w:themeColor="text1"/>
+          <w:kern w:val="0"/>
+          <w:sz w:val="21"/>
+          <w:szCs w:val="21"/>
+          <w:lang w:eastAsia="es-AR"/>
+          <w14:ligatures w14:val="none"/>
+        </w:rPr>
+      </w:pPr>
+      <w:r>
+        <w:rPr>
+          <w:rFonts w:ascii="Consolas" w:eastAsia="Times New Roman" w:hAnsi="Consolas" w:cs="Times New Roman"/>
+          <w:color w:val="000000" w:themeColor="text1"/>
+          <w:kern w:val="0"/>
+          <w:sz w:val="21"/>
+          <w:szCs w:val="21"/>
+          <w:lang w:eastAsia="es-AR"/>
+          <w14:ligatures w14:val="none"/>
+        </w:rPr>
+        <w:t>estado               2.321431       2.301187      0.020244</w:t>
+      </w:r>
+    </w:p>
+    <w:p>
+      <w:pPr>
+        <w:spacing w:after="0" w:line="240" w:lineRule="auto"/>
+        <w:rPr>
+          <w:rFonts w:ascii="Consolas" w:eastAsia="Times New Roman" w:hAnsi="Consolas" w:cs="Times New Roman"/>
+          <w:color w:val="000000" w:themeColor="text1"/>
+          <w:kern w:val="0"/>
+          <w:sz w:val="21"/>
+          <w:szCs w:val="21"/>
+          <w:lang w:eastAsia="es-AR"/>
+          <w14:ligatures w14:val="none"/>
+        </w:rPr>
+      </w:pPr>
+      <w:proofErr w:type="spellStart"/>
+      <w:r>
+        <w:rPr>
+          <w:rFonts w:ascii="Consolas" w:eastAsia="Times New Roman" w:hAnsi="Consolas" w:cs="Times New Roman"/>
+          <w:color w:val="000000" w:themeColor="text1"/>
+          <w:kern w:val="0"/>
+          <w:sz w:val="21"/>
+          <w:szCs w:val="21"/>
+          <w:lang w:eastAsia="es-AR"/>
+          <w14:ligatures w14:val="none"/>
+        </w:rPr>
+        <w:t>cat_inac</w:t>
+      </w:r>
+      <w:proofErr w:type="spellEnd"/>
+      <w:r>
+        <w:rPr>
+          <w:rFonts w:ascii="Consolas" w:eastAsia="Times New Roman" w:hAnsi="Consolas" w:cs="Times New Roman"/>
+          <w:color w:val="000000" w:themeColor="text1"/>
+          <w:kern w:val="0"/>
+          <w:sz w:val="21"/>
+          <w:szCs w:val="21"/>
+          <w:lang w:eastAsia="es-AR"/>
+          <w14:ligatures w14:val="none"/>
+        </w:rPr>
+        <w:t xml:space="preserve">             3.413437       3.402459      0.010978</w:t>
+      </w:r>
+    </w:p>
+    <w:p>
+      <w:pPr>
+        <w:spacing w:after="0" w:line="240" w:lineRule="auto"/>
+        <w:rPr>
+          <w:rFonts w:ascii="Consolas" w:eastAsia="Times New Roman" w:hAnsi="Consolas" w:cs="Times New Roman"/>
+          <w:color w:val="000000" w:themeColor="text1"/>
+          <w:kern w:val="0"/>
+          <w:sz w:val="21"/>
+          <w:szCs w:val="21"/>
+          <w:lang w:val="en-US" w:eastAsia="es-AR"/>
+          <w14:ligatures w14:val="none"/>
+        </w:rPr>
+      </w:pPr>
+      <w:proofErr w:type="spellStart"/>
+      <w:r>
+        <w:rPr>
+          <w:rFonts w:ascii="Consolas" w:eastAsia="Times New Roman" w:hAnsi="Consolas" w:cs="Times New Roman"/>
+          <w:color w:val="000000" w:themeColor="text1"/>
+          <w:kern w:val="0"/>
+          <w:sz w:val="21"/>
+          <w:szCs w:val="21"/>
+          <w:lang w:val="en-US" w:eastAsia="es-AR"/>
+          <w14:ligatures w14:val="none"/>
+        </w:rPr>
+        <w:t>cat_ocup</w:t>
+      </w:r>
+      <w:proofErr w:type="spellEnd"/>
+      <w:r>
+        <w:rPr>
+          <w:rFonts w:ascii="Consolas" w:eastAsia="Times New Roman" w:hAnsi="Consolas" w:cs="Times New Roman"/>
+          <w:color w:val="000000" w:themeColor="text1"/>
+          <w:kern w:val="0"/>
+          <w:sz w:val="21"/>
+          <w:szCs w:val="21"/>
+          <w:lang w:val="en-US" w:eastAsia="es-AR"/>
+          <w14:ligatures w14:val="none"/>
+        </w:rPr>
+        <w:t xml:space="preserve">             2.744574       2.758738     -0.014164</w:t>
+      </w:r>
+    </w:p>
+    <w:p>
+      <w:pPr>
+        <w:spacing w:after="0" w:line="240" w:lineRule="auto"/>
+        <w:rPr>
+          <w:rFonts w:ascii="Consolas" w:eastAsia="Times New Roman" w:hAnsi="Consolas" w:cs="Times New Roman"/>
+          <w:color w:val="000000" w:themeColor="text1"/>
+          <w:kern w:val="0"/>
+          <w:sz w:val="21"/>
+          <w:szCs w:val="21"/>
+          <w:lang w:val="en-US" w:eastAsia="es-AR"/>
+          <w14:ligatures w14:val="none"/>
+        </w:rPr>
+      </w:pPr>
+      <w:r>
+        <w:rPr>
+          <w:rFonts w:ascii="Consolas" w:eastAsia="Times New Roman" w:hAnsi="Consolas" w:cs="Times New Roman"/>
+          <w:color w:val="000000" w:themeColor="text1"/>
+          <w:kern w:val="0"/>
+          <w:sz w:val="21"/>
+          <w:szCs w:val="21"/>
+          <w:lang w:val="en-US" w:eastAsia="es-AR"/>
+          <w14:ligatures w14:val="none"/>
+        </w:rPr>
+        <w:t>pp10a                2.917391       2.950549     -0.033158</w:t>
+      </w:r>
+    </w:p>
+    <w:p>
+      <w:pPr>
+        <w:spacing w:after="0" w:line="240" w:lineRule="auto"/>
+        <w:rPr>
+          <w:rFonts w:ascii="Consolas" w:eastAsia="Times New Roman" w:hAnsi="Consolas" w:cs="Times New Roman"/>
+          <w:color w:val="000000" w:themeColor="text1"/>
+          <w:kern w:val="0"/>
+          <w:sz w:val="21"/>
+          <w:szCs w:val="21"/>
+          <w:lang w:val="en-US" w:eastAsia="es-AR"/>
+          <w14:ligatures w14:val="none"/>
+        </w:rPr>
+      </w:pPr>
+      <w:r>
+        <w:rPr>
+          <w:rFonts w:ascii="Consolas" w:eastAsia="Times New Roman" w:hAnsi="Consolas" w:cs="Times New Roman"/>
+          <w:color w:val="000000" w:themeColor="text1"/>
+          <w:kern w:val="0"/>
+          <w:sz w:val="21"/>
+          <w:szCs w:val="21"/>
+          <w:lang w:val="en-US" w:eastAsia="es-AR"/>
+          <w14:ligatures w14:val="none"/>
+        </w:rPr>
+        <w:t xml:space="preserve">p21             </w:t>
+      </w:r>
+      <w:proofErr w:type="gramStart"/>
+      <w:r>
+        <w:rPr>
+          <w:rFonts w:ascii="Consolas" w:eastAsia="Times New Roman" w:hAnsi="Consolas" w:cs="Times New Roman"/>
+          <w:color w:val="000000" w:themeColor="text1"/>
+          <w:kern w:val="0"/>
+          <w:sz w:val="21"/>
+          <w:szCs w:val="21"/>
+          <w:lang w:val="en-US" w:eastAsia="es-AR"/>
+          <w14:ligatures w14:val="none"/>
+        </w:rPr>
+        <w:t>309272.375026  314760.172283</w:t>
+      </w:r>
+      <w:proofErr w:type="gramEnd"/>
+      <w:r>
+        <w:rPr>
+          <w:rFonts w:ascii="Consolas" w:eastAsia="Times New Roman" w:hAnsi="Consolas" w:cs="Times New Roman"/>
+          <w:color w:val="000000" w:themeColor="text1"/>
+          <w:kern w:val="0"/>
+          <w:sz w:val="21"/>
+          <w:szCs w:val="21"/>
+          <w:lang w:val="en-US" w:eastAsia="es-AR"/>
+          <w14:ligatures w14:val="none"/>
+        </w:rPr>
+        <w:t xml:space="preserve">  -5487.797257</w:t>
+      </w:r>
+    </w:p>
+    <w:p>
+      <w:pPr>
+        <w:spacing w:after="0" w:line="240" w:lineRule="auto"/>
+        <w:rPr>
+          <w:rFonts w:ascii="Consolas" w:eastAsia="Times New Roman" w:hAnsi="Consolas" w:cs="Times New Roman"/>
+          <w:color w:val="000000" w:themeColor="text1"/>
+          <w:kern w:val="0"/>
+          <w:sz w:val="21"/>
+          <w:szCs w:val="21"/>
+          <w:lang w:val="en-US" w:eastAsia="es-AR"/>
+          <w14:ligatures w14:val="none"/>
+        </w:rPr>
+      </w:pPr>
+      <w:proofErr w:type="spellStart"/>
+      <w:r>
+        <w:rPr>
+          <w:rFonts w:ascii="Consolas" w:eastAsia="Times New Roman" w:hAnsi="Consolas" w:cs="Times New Roman"/>
+          <w:color w:val="000000" w:themeColor="text1"/>
+          <w:kern w:val="0"/>
+          <w:sz w:val="21"/>
+          <w:szCs w:val="21"/>
+          <w:lang w:val="en-US" w:eastAsia="es-AR"/>
+          <w14:ligatures w14:val="none"/>
+        </w:rPr>
+        <w:t>t_vi</w:t>
+      </w:r>
+      <w:proofErr w:type="spellEnd"/>
+      <w:r>
+        <w:rPr>
+          <w:rFonts w:ascii="Consolas" w:eastAsia="Times New Roman" w:hAnsi="Consolas" w:cs="Times New Roman"/>
+          <w:color w:val="000000" w:themeColor="text1"/>
+          <w:kern w:val="0"/>
+          <w:sz w:val="21"/>
+          <w:szCs w:val="21"/>
+          <w:lang w:val="en-US" w:eastAsia="es-AR"/>
+          <w14:ligatures w14:val="none"/>
+        </w:rPr>
+        <w:t xml:space="preserve">            </w:t>
+      </w:r>
+      <w:proofErr w:type="gramStart"/>
+      <w:r>
+        <w:rPr>
+          <w:rFonts w:ascii="Consolas" w:eastAsia="Times New Roman" w:hAnsi="Consolas" w:cs="Times New Roman"/>
+          <w:color w:val="000000" w:themeColor="text1"/>
+          <w:kern w:val="0"/>
+          <w:sz w:val="21"/>
+          <w:szCs w:val="21"/>
+          <w:lang w:val="en-US" w:eastAsia="es-AR"/>
+          <w14:ligatures w14:val="none"/>
+        </w:rPr>
+        <w:t>258066.373106  272706.535135</w:t>
+      </w:r>
+      <w:proofErr w:type="gramEnd"/>
+      <w:r>
+        <w:rPr>
+          <w:rFonts w:ascii="Consolas" w:eastAsia="Times New Roman" w:hAnsi="Consolas" w:cs="Times New Roman"/>
+          <w:color w:val="000000" w:themeColor="text1"/>
+          <w:kern w:val="0"/>
+          <w:sz w:val="21"/>
+          <w:szCs w:val="21"/>
+          <w:lang w:val="en-US" w:eastAsia="es-AR"/>
+          <w14:ligatures w14:val="none"/>
+        </w:rPr>
+        <w:t xml:space="preserve"> -14640.162029</w:t>
+      </w:r>
+    </w:p>
+    <w:p>
+      <w:pPr>
+        <w:spacing w:after="0" w:line="240" w:lineRule="auto"/>
+        <w:rPr>
+          <w:rFonts w:ascii="Consolas" w:eastAsia="Times New Roman" w:hAnsi="Consolas" w:cs="Times New Roman"/>
+          <w:color w:val="000000" w:themeColor="text1"/>
+          <w:kern w:val="0"/>
+          <w:sz w:val="21"/>
+          <w:szCs w:val="21"/>
+          <w:lang w:eastAsia="es-AR"/>
+          <w14:ligatures w14:val="none"/>
+        </w:rPr>
+      </w:pPr>
+      <w:proofErr w:type="spellStart"/>
+      <w:r>
+        <w:rPr>
+          <w:rFonts w:ascii="Consolas" w:eastAsia="Times New Roman" w:hAnsi="Consolas" w:cs="Times New Roman"/>
+          <w:color w:val="000000" w:themeColor="text1"/>
+          <w:kern w:val="0"/>
+          <w:sz w:val="21"/>
+          <w:szCs w:val="21"/>
+          <w:lang w:eastAsia="es-AR"/>
+          <w14:ligatures w14:val="none"/>
+        </w:rPr>
+        <w:t>adulto_esquiv</w:t>
+      </w:r>
+      <w:proofErr w:type="spellEnd"/>
+      <w:r>
+        <w:rPr>
+          <w:rFonts w:ascii="Consolas" w:eastAsia="Times New Roman" w:hAnsi="Consolas" w:cs="Times New Roman"/>
+          <w:color w:val="000000" w:themeColor="text1"/>
+          <w:kern w:val="0"/>
+          <w:sz w:val="21"/>
+          <w:szCs w:val="21"/>
+          <w:lang w:eastAsia="es-AR"/>
+          <w14:ligatures w14:val="none"/>
+        </w:rPr>
+        <w:t xml:space="preserve">        0.810421       0.809940      0.000481</w:t>
+      </w:r>
+    </w:p>
+    <w:p>
+      <w:pPr>
+        <w:spacing w:after="0" w:line="240" w:lineRule="auto"/>
+        <w:rPr>
+          <w:rFonts w:ascii="Consolas" w:eastAsia="Times New Roman" w:hAnsi="Consolas" w:cs="Times New Roman"/>
+          <w:color w:val="000000" w:themeColor="text1"/>
+          <w:kern w:val="0"/>
+          <w:sz w:val="21"/>
+          <w:szCs w:val="21"/>
+          <w:lang w:eastAsia="es-AR"/>
+          <w14:ligatures w14:val="none"/>
+        </w:rPr>
+      </w:pPr>
+      <w:proofErr w:type="spellStart"/>
+      <w:r>
+        <w:rPr>
+          <w:rFonts w:ascii="Consolas" w:eastAsia="Times New Roman" w:hAnsi="Consolas" w:cs="Times New Roman"/>
+          <w:color w:val="000000" w:themeColor="text1"/>
+          <w:kern w:val="0"/>
+          <w:sz w:val="21"/>
+          <w:szCs w:val="21"/>
+          <w:lang w:eastAsia="es-AR"/>
+          <w14:ligatures w14:val="none"/>
+        </w:rPr>
+        <w:t>ad_equiv_hogar</w:t>
+      </w:r>
+      <w:proofErr w:type="spellEnd"/>
+      <w:r>
+        <w:rPr>
+          <w:rFonts w:ascii="Consolas" w:eastAsia="Times New Roman" w:hAnsi="Consolas" w:cs="Times New Roman"/>
+          <w:color w:val="000000" w:themeColor="text1"/>
+          <w:kern w:val="0"/>
+          <w:sz w:val="21"/>
+          <w:szCs w:val="21"/>
+          <w:lang w:eastAsia="es-AR"/>
+          <w14:ligatures w14:val="none"/>
+        </w:rPr>
+        <w:t xml:space="preserve">       3.749800       3.777778     -0.027978</w:t>
+      </w:r>
+    </w:p>
+    <w:p>
+      <w:pPr>
+        <w:rPr>
+          <w:rFonts w:ascii="Consolas" w:eastAsia="Times New Roman" w:hAnsi="Consolas" w:cs="Times New Roman"/>
+          <w:color w:val="000000" w:themeColor="text1"/>
+          <w:kern w:val="0"/>
+          <w:sz w:val="21"/>
+          <w:szCs w:val="21"/>
+          <w:lang w:eastAsia="es-AR"/>
+          <w14:ligatures w14:val="none"/>
+        </w:rPr>
+      </w:pPr>
+      <w:proofErr w:type="spellStart"/>
+      <w:r>
+        <w:rPr>
+          <w:rFonts w:ascii="Consolas" w:eastAsia="Times New Roman" w:hAnsi="Consolas" w:cs="Times New Roman"/>
+          <w:color w:val="000000" w:themeColor="text1"/>
+          <w:kern w:val="0"/>
+          <w:sz w:val="21"/>
+          <w:szCs w:val="21"/>
+          <w:lang w:eastAsia="es-AR"/>
+          <w14:ligatures w14:val="none"/>
+        </w:rPr>
+        <w:t>intercept</w:t>
+      </w:r>
+      <w:proofErr w:type="spellEnd"/>
+      <w:r>
+        <w:rPr>
+          <w:rFonts w:ascii="Consolas" w:eastAsia="Times New Roman" w:hAnsi="Consolas" w:cs="Times New Roman"/>
+          <w:color w:val="000000" w:themeColor="text1"/>
+          <w:kern w:val="0"/>
+          <w:sz w:val="21"/>
+          <w:szCs w:val="21"/>
+          <w:lang w:eastAsia="es-AR"/>
+          <w14:ligatures w14:val="none"/>
+        </w:rPr>
+        <w:t xml:space="preserve">            1.000000       1.000000      0.000000</w:t>
+      </w:r>
+    </w:p>
+    <w:p>
+      <w:pPr>
+        <w:rPr>
+          <w:rFonts w:ascii="Consolas" w:eastAsia="Times New Roman" w:hAnsi="Consolas" w:cs="Times New Roman"/>
+          <w:color w:val="000000" w:themeColor="text1"/>
+          <w:kern w:val="0"/>
+          <w:sz w:val="21"/>
+          <w:szCs w:val="21"/>
+          <w:lang w:eastAsia="es-AR"/>
+          <w14:ligatures w14:val="none"/>
+        </w:rPr>
+      </w:pPr>
+    </w:p>
+    <w:p>
+      <w:pPr>
+        <w:rPr>
+          <w:rFonts w:ascii="Consolas" w:eastAsia="Times New Roman" w:hAnsi="Consolas" w:cs="Times New Roman"/>
+          <w:color w:val="000000" w:themeColor="text1"/>
+          <w:kern w:val="0"/>
+          <w:sz w:val="21"/>
+          <w:szCs w:val="21"/>
+          <w:lang w:eastAsia="es-AR"/>
+          <w14:ligatures w14:val="none"/>
+        </w:rPr>
+      </w:pPr>
+      <w:r>
+        <w:rPr>
+          <w:rFonts w:ascii="Consolas" w:eastAsia="Times New Roman" w:hAnsi="Consolas" w:cs="Times New Roman"/>
+          <w:color w:val="000000" w:themeColor="text1"/>
+          <w:kern w:val="0"/>
+          <w:sz w:val="21"/>
+          <w:szCs w:val="21"/>
+          <w:lang w:eastAsia="es-AR"/>
+          <w14:ligatures w14:val="none"/>
+        </w:rPr>
+        <w:t xml:space="preserve">Consigna </w:t>
+      </w:r>
+      <w:r>
+        <w:rPr>
+          <w:rFonts w:ascii="Consolas" w:eastAsia="Times New Roman" w:hAnsi="Consolas" w:cs="Times New Roman"/>
+          <w:color w:val="000000" w:themeColor="text1"/>
+          <w:kern w:val="0"/>
+          <w:sz w:val="21"/>
+          <w:szCs w:val="21"/>
+          <w:lang w:eastAsia="es-AR"/>
+          <w14:ligatures w14:val="none"/>
+        </w:rPr>
+        <w:t>3</w:t>
+      </w:r>
+    </w:p>
+    <w:p>
+      <w:pPr>
+        <w:jc w:val="both"/>
+        <w:rPr>
+          <w:rFonts w:ascii="Consolas" w:eastAsia="Times New Roman" w:hAnsi="Consolas" w:cs="Times New Roman"/>
+          <w:color w:val="000000" w:themeColor="text1"/>
+          <w:kern w:val="0"/>
+          <w:sz w:val="21"/>
+          <w:szCs w:val="21"/>
+          <w:lang w:eastAsia="es-AR"/>
+          <w14:ligatures w14:val="none"/>
+        </w:rPr>
+      </w:pPr>
+      <w:r>
+        <w:rPr>
+          <w:rFonts w:ascii="Consolas" w:eastAsia="Times New Roman" w:hAnsi="Consolas" w:cs="Times New Roman"/>
+          <w:color w:val="000000" w:themeColor="text1"/>
+          <w:kern w:val="0"/>
+          <w:sz w:val="21"/>
+          <w:szCs w:val="21"/>
+          <w:lang w:eastAsia="es-AR"/>
+          <w14:ligatures w14:val="none"/>
+        </w:rPr>
+        <w:t>El modelo logístico estimado para el año 2025 muestra que varias características sociodemográficas y laborales están significativamente asociadas con la probabilidad de ser pobre. En primer lugar, la edad (ch06) presenta un coeficiente negativo y significativo, indicando que, manteniendo todo lo demás constante, las personas de mayor edad tienen una probabilidad ligeramente menor de ser pobres, probablemente porque acumulan más experiencia laboral y estabilidad económica. De manera consistente, el nivel educativo (</w:t>
+      </w:r>
+      <w:proofErr w:type="spellStart"/>
+      <w:r>
+        <w:rPr>
+          <w:rFonts w:ascii="Consolas" w:eastAsia="Times New Roman" w:hAnsi="Consolas" w:cs="Times New Roman"/>
+          <w:color w:val="000000" w:themeColor="text1"/>
+          <w:kern w:val="0"/>
+          <w:sz w:val="21"/>
+          <w:szCs w:val="21"/>
+          <w:lang w:eastAsia="es-AR"/>
+          <w14:ligatures w14:val="none"/>
+        </w:rPr>
+        <w:t>nivel_ed</w:t>
+      </w:r>
+      <w:proofErr w:type="spellEnd"/>
+      <w:r>
+        <w:rPr>
+          <w:rFonts w:ascii="Consolas" w:eastAsia="Times New Roman" w:hAnsi="Consolas" w:cs="Times New Roman"/>
+          <w:color w:val="000000" w:themeColor="text1"/>
+          <w:kern w:val="0"/>
+          <w:sz w:val="21"/>
+          <w:szCs w:val="21"/>
+          <w:lang w:eastAsia="es-AR"/>
+          <w14:ligatures w14:val="none"/>
+        </w:rPr>
+        <w:t>) también reduce fuertemente la probabilidad de pobreza: cada incremento en el nivel educativo disminuye de forma sustancial la probabilidad estimada de ser pobre, lo cual coincide con la evidencia empírica sobre los retornos de la educación en el mercado laboral argentino.</w:t>
+      </w:r>
+    </w:p>
+    <w:p>
+      <w:pPr>
+        <w:jc w:val="both"/>
+        <w:rPr>
+          <w:rFonts w:ascii="Consolas" w:eastAsia="Times New Roman" w:hAnsi="Consolas" w:cs="Times New Roman"/>
+          <w:color w:val="000000" w:themeColor="text1"/>
+          <w:kern w:val="0"/>
+          <w:sz w:val="21"/>
+          <w:szCs w:val="21"/>
+          <w:lang w:eastAsia="es-AR"/>
+          <w14:ligatures w14:val="none"/>
+        </w:rPr>
+      </w:pPr>
+      <w:r>
+        <w:rPr>
+          <w:rFonts w:ascii="Consolas" w:eastAsia="Times New Roman" w:hAnsi="Consolas" w:cs="Times New Roman"/>
+          <w:color w:val="000000" w:themeColor="text1"/>
+          <w:kern w:val="0"/>
+          <w:sz w:val="21"/>
+          <w:szCs w:val="21"/>
+          <w:lang w:eastAsia="es-AR"/>
+          <w14:ligatures w14:val="none"/>
+        </w:rPr>
+        <w:t>En contraste, variables vinculadas a la situación laboral incrementan la probabilidad de pobreza. Estar en una categoría laboral más precaria (estado, donde valores altos suelen reflejar desocupación o inactividad) aumenta significativamente la probabilidad de ser pobre. Asimismo, quienes pertenecen a determinadas categorías de inactividad (</w:t>
+      </w:r>
+      <w:proofErr w:type="spellStart"/>
+      <w:r>
+        <w:rPr>
+          <w:rFonts w:ascii="Consolas" w:eastAsia="Times New Roman" w:hAnsi="Consolas" w:cs="Times New Roman"/>
+          <w:color w:val="000000" w:themeColor="text1"/>
+          <w:kern w:val="0"/>
+          <w:sz w:val="21"/>
+          <w:szCs w:val="21"/>
+          <w:lang w:eastAsia="es-AR"/>
+          <w14:ligatures w14:val="none"/>
+        </w:rPr>
+        <w:t>cat_inac</w:t>
+      </w:r>
+      <w:proofErr w:type="spellEnd"/>
+      <w:r>
+        <w:rPr>
+          <w:rFonts w:ascii="Consolas" w:eastAsia="Times New Roman" w:hAnsi="Consolas" w:cs="Times New Roman"/>
+          <w:color w:val="000000" w:themeColor="text1"/>
+          <w:kern w:val="0"/>
+          <w:sz w:val="21"/>
+          <w:szCs w:val="21"/>
+          <w:lang w:eastAsia="es-AR"/>
+          <w14:ligatures w14:val="none"/>
+        </w:rPr>
+        <w:t>) presentan mayor riesgo, mientras que quienes ocupan categorías laborales más formales o de mayor jerarquía (</w:t>
+      </w:r>
+      <w:proofErr w:type="spellStart"/>
+      <w:r>
+        <w:rPr>
+          <w:rFonts w:ascii="Consolas" w:eastAsia="Times New Roman" w:hAnsi="Consolas" w:cs="Times New Roman"/>
+          <w:color w:val="000000" w:themeColor="text1"/>
+          <w:kern w:val="0"/>
+          <w:sz w:val="21"/>
+          <w:szCs w:val="21"/>
+          <w:lang w:eastAsia="es-AR"/>
+          <w14:ligatures w14:val="none"/>
+        </w:rPr>
+        <w:t>cat_ocup</w:t>
+      </w:r>
+      <w:proofErr w:type="spellEnd"/>
+      <w:r>
+        <w:rPr>
+          <w:rFonts w:ascii="Consolas" w:eastAsia="Times New Roman" w:hAnsi="Consolas" w:cs="Times New Roman"/>
+          <w:color w:val="000000" w:themeColor="text1"/>
+          <w:kern w:val="0"/>
+          <w:sz w:val="21"/>
+          <w:szCs w:val="21"/>
+          <w:lang w:eastAsia="es-AR"/>
+          <w14:ligatures w14:val="none"/>
+        </w:rPr>
+        <w:t xml:space="preserve">) reducen su probabilidad de ser pobres. Las variables económicas del hogar también resultan claves: pp10a (ingresos laborales individuales declarados), cuando aumenta, se asocia positivamente con la probabilidad de pobreza debido a la lógica inversa del índice de ingresos usado en la imputación; y tanto p21 como </w:t>
+      </w:r>
+      <w:proofErr w:type="spellStart"/>
+      <w:r>
+        <w:rPr>
+          <w:rFonts w:ascii="Consolas" w:eastAsia="Times New Roman" w:hAnsi="Consolas" w:cs="Times New Roman"/>
+          <w:color w:val="000000" w:themeColor="text1"/>
+          <w:kern w:val="0"/>
+          <w:sz w:val="21"/>
+          <w:szCs w:val="21"/>
+          <w:lang w:eastAsia="es-AR"/>
+          <w14:ligatures w14:val="none"/>
+        </w:rPr>
+        <w:t>t_vi</w:t>
+      </w:r>
+      <w:proofErr w:type="spellEnd"/>
+      <w:r>
+        <w:rPr>
+          <w:rFonts w:ascii="Consolas" w:eastAsia="Times New Roman" w:hAnsi="Consolas" w:cs="Times New Roman"/>
+          <w:color w:val="000000" w:themeColor="text1"/>
+          <w:kern w:val="0"/>
+          <w:sz w:val="21"/>
+          <w:szCs w:val="21"/>
+          <w:lang w:eastAsia="es-AR"/>
+          <w14:ligatures w14:val="none"/>
+        </w:rPr>
+        <w:t xml:space="preserve">, que son montos monetarios y valor de bienes, presentan coeficientes negativos, sugiriendo que mayores activos y transferencias contribuyen a reducir el riesgo de pobreza. Finalmente, indicadores de composición familiar como </w:t>
+      </w:r>
+      <w:proofErr w:type="spellStart"/>
+      <w:r>
+        <w:rPr>
+          <w:rFonts w:ascii="Consolas" w:eastAsia="Times New Roman" w:hAnsi="Consolas" w:cs="Times New Roman"/>
+          <w:color w:val="000000" w:themeColor="text1"/>
+          <w:kern w:val="0"/>
+          <w:sz w:val="21"/>
+          <w:szCs w:val="21"/>
+          <w:lang w:eastAsia="es-AR"/>
+          <w14:ligatures w14:val="none"/>
+        </w:rPr>
+        <w:t>adulto_esquiv</w:t>
+      </w:r>
+      <w:proofErr w:type="spellEnd"/>
+      <w:r>
+        <w:rPr>
+          <w:rFonts w:ascii="Consolas" w:eastAsia="Times New Roman" w:hAnsi="Consolas" w:cs="Times New Roman"/>
+          <w:color w:val="000000" w:themeColor="text1"/>
+          <w:kern w:val="0"/>
+          <w:sz w:val="21"/>
+          <w:szCs w:val="21"/>
+          <w:lang w:eastAsia="es-AR"/>
+          <w14:ligatures w14:val="none"/>
+        </w:rPr>
+        <w:t xml:space="preserve"> y </w:t>
+      </w:r>
+      <w:proofErr w:type="spellStart"/>
+      <w:r>
+        <w:rPr>
+          <w:rFonts w:ascii="Consolas" w:eastAsia="Times New Roman" w:hAnsi="Consolas" w:cs="Times New Roman"/>
+          <w:color w:val="000000" w:themeColor="text1"/>
+          <w:kern w:val="0"/>
+          <w:sz w:val="21"/>
+          <w:szCs w:val="21"/>
+          <w:lang w:eastAsia="es-AR"/>
+          <w14:ligatures w14:val="none"/>
+        </w:rPr>
+        <w:t>ad_equiv_hogar</w:t>
+      </w:r>
+      <w:proofErr w:type="spellEnd"/>
+      <w:r>
+        <w:rPr>
+          <w:rFonts w:ascii="Consolas" w:eastAsia="Times New Roman" w:hAnsi="Consolas" w:cs="Times New Roman"/>
+          <w:color w:val="000000" w:themeColor="text1"/>
+          <w:kern w:val="0"/>
+          <w:sz w:val="21"/>
+          <w:szCs w:val="21"/>
+          <w:lang w:eastAsia="es-AR"/>
+          <w14:ligatures w14:val="none"/>
+        </w:rPr>
+        <w:t xml:space="preserve"> muestran que mayores necesidades económicas por estructura del hogar incrementan </w:t>
+      </w:r>
+      <w:r>
+        <w:rPr>
+          <w:rFonts w:ascii="Consolas" w:eastAsia="Times New Roman" w:hAnsi="Consolas" w:cs="Times New Roman"/>
+          <w:color w:val="000000" w:themeColor="text1"/>
+          <w:kern w:val="0"/>
+          <w:sz w:val="21"/>
+          <w:szCs w:val="21"/>
+          <w:lang w:eastAsia="es-AR"/>
+          <w14:ligatures w14:val="none"/>
+        </w:rPr>
+        <w:lastRenderedPageBreak/>
+        <w:t>fuertemente la probabilidad de pobreza. En conjunto, el modelo ofrece un ajuste razonable (Pseudo R² ≈ 0.20) y confirma que las condiciones laborales, el capital humano y la estructura del hogar son determinantes centrales de la pobreza en la región analizada durante 2025.</w:t>
+      </w:r>
+    </w:p>
+    <w:p>
+      <w:pPr>
+        <w:rPr>
+          <w:color w:val="000000" w:themeColor="text1"/>
+          <w:sz w:val="28"/>
+          <w:szCs w:val="28"/>
+          <w:lang w:val="en-US"/>
+        </w:rPr>
+      </w:pPr>
+      <w:r>
+        <w:rPr>
+          <w:color w:val="000000" w:themeColor="text1"/>
+          <w:sz w:val="28"/>
+          <w:szCs w:val="28"/>
+          <w:lang w:val="en-US"/>
+        </w:rPr>
+        <w:t xml:space="preserve">Optimization </w:t>
+      </w:r>
+      <w:proofErr w:type="gramStart"/>
+      <w:r>
+        <w:rPr>
+          <w:color w:val="000000" w:themeColor="text1"/>
+          <w:sz w:val="28"/>
+          <w:szCs w:val="28"/>
+          <w:lang w:val="en-US"/>
+        </w:rPr>
+        <w:t>terminated</w:t>
+      </w:r>
+      <w:proofErr w:type="gramEnd"/>
+      <w:r>
+        <w:rPr>
+          <w:color w:val="000000" w:themeColor="text1"/>
+          <w:sz w:val="28"/>
+          <w:szCs w:val="28"/>
+          <w:lang w:val="en-US"/>
+        </w:rPr>
+        <w:t xml:space="preserve"> successfully.</w:t>
+      </w:r>
+    </w:p>
+    <w:p>
+      <w:pPr>
+        <w:rPr>
+          <w:color w:val="000000" w:themeColor="text1"/>
+          <w:sz w:val="28"/>
+          <w:szCs w:val="28"/>
+          <w:lang w:val="en-US"/>
+        </w:rPr>
+      </w:pPr>
+      <w:r>
+        <w:rPr>
+          <w:color w:val="000000" w:themeColor="text1"/>
+          <w:sz w:val="28"/>
+          <w:szCs w:val="28"/>
+          <w:lang w:val="en-US"/>
+        </w:rPr>
+        <w:t xml:space="preserve">         Current function value: 0.553029</w:t>
+      </w:r>
+    </w:p>
+    <w:p>
+      <w:pPr>
+        <w:rPr>
+          <w:color w:val="000000" w:themeColor="text1"/>
+          <w:sz w:val="28"/>
+          <w:szCs w:val="28"/>
+          <w:lang w:val="en-US"/>
+        </w:rPr>
+      </w:pPr>
+      <w:r>
+        <w:rPr>
+          <w:color w:val="000000" w:themeColor="text1"/>
+          <w:sz w:val="28"/>
+          <w:szCs w:val="28"/>
+          <w:lang w:val="en-US"/>
+        </w:rPr>
+        <w:t xml:space="preserve">         Iterations 7</w:t>
+      </w:r>
+    </w:p>
+    <w:p>
+      <w:pPr>
+        <w:rPr>
+          <w:color w:val="000000" w:themeColor="text1"/>
+          <w:sz w:val="28"/>
+          <w:szCs w:val="28"/>
+          <w:lang w:val="en-US"/>
+        </w:rPr>
+      </w:pPr>
+      <w:r>
+        <w:rPr>
+          <w:color w:val="000000" w:themeColor="text1"/>
+          <w:sz w:val="28"/>
+          <w:szCs w:val="28"/>
+          <w:lang w:val="en-US"/>
+        </w:rPr>
+        <w:t xml:space="preserve">                           Logit Regression Results                           </w:t>
+      </w:r>
+    </w:p>
+    <w:p>
+      <w:pPr>
+        <w:rPr>
+          <w:color w:val="000000" w:themeColor="text1"/>
+          <w:sz w:val="28"/>
+          <w:szCs w:val="28"/>
+          <w:lang w:val="en-US"/>
+        </w:rPr>
+      </w:pPr>
+      <w:r>
+        <w:rPr>
+          <w:color w:val="000000" w:themeColor="text1"/>
+          <w:sz w:val="28"/>
+          <w:szCs w:val="28"/>
+          <w:lang w:val="en-US"/>
+        </w:rPr>
+        <w:t>==============================================================================</w:t>
+      </w:r>
+    </w:p>
+    <w:p>
+      <w:pPr>
+        <w:rPr>
+          <w:color w:val="000000" w:themeColor="text1"/>
+          <w:sz w:val="28"/>
+          <w:szCs w:val="28"/>
+          <w:lang w:val="en-US"/>
+        </w:rPr>
+      </w:pPr>
+      <w:r>
+        <w:rPr>
+          <w:color w:val="000000" w:themeColor="text1"/>
+          <w:sz w:val="28"/>
+          <w:szCs w:val="28"/>
+          <w:lang w:val="en-US"/>
+        </w:rPr>
+        <w:t xml:space="preserve">Dep. Variable:                  </w:t>
+      </w:r>
+      <w:proofErr w:type="spellStart"/>
+      <w:r>
+        <w:rPr>
+          <w:color w:val="000000" w:themeColor="text1"/>
+          <w:sz w:val="28"/>
+          <w:szCs w:val="28"/>
+          <w:lang w:val="en-US"/>
+        </w:rPr>
+        <w:t>pobre</w:t>
+      </w:r>
+      <w:proofErr w:type="spellEnd"/>
+      <w:r>
+        <w:rPr>
+          <w:color w:val="000000" w:themeColor="text1"/>
+          <w:sz w:val="28"/>
+          <w:szCs w:val="28"/>
+          <w:lang w:val="en-US"/>
+        </w:rPr>
+        <w:t xml:space="preserve">   No. Observations:                 6086</w:t>
+      </w:r>
+    </w:p>
+    <w:p>
+      <w:pPr>
+        <w:rPr>
+          <w:color w:val="000000" w:themeColor="text1"/>
+          <w:sz w:val="28"/>
+          <w:szCs w:val="28"/>
+          <w:lang w:val="en-US"/>
+        </w:rPr>
+      </w:pPr>
+      <w:r>
+        <w:rPr>
+          <w:color w:val="000000" w:themeColor="text1"/>
+          <w:sz w:val="28"/>
+          <w:szCs w:val="28"/>
+          <w:lang w:val="en-US"/>
+        </w:rPr>
+        <w:t xml:space="preserve">Model:                          Logit   </w:t>
+      </w:r>
+      <w:proofErr w:type="spellStart"/>
+      <w:r>
+        <w:rPr>
+          <w:color w:val="000000" w:themeColor="text1"/>
+          <w:sz w:val="28"/>
+          <w:szCs w:val="28"/>
+          <w:lang w:val="en-US"/>
+        </w:rPr>
+        <w:t>Df</w:t>
+      </w:r>
+      <w:proofErr w:type="spellEnd"/>
+      <w:r>
+        <w:rPr>
+          <w:color w:val="000000" w:themeColor="text1"/>
+          <w:sz w:val="28"/>
+          <w:szCs w:val="28"/>
+          <w:lang w:val="en-US"/>
+        </w:rPr>
+        <w:t xml:space="preserve"> Residuals:                     6075</w:t>
+      </w:r>
+    </w:p>
+    <w:p>
+      <w:pPr>
+        <w:rPr>
+          <w:color w:val="000000" w:themeColor="text1"/>
+          <w:sz w:val="28"/>
+          <w:szCs w:val="28"/>
+          <w:lang w:val="en-US"/>
+        </w:rPr>
+      </w:pPr>
+      <w:r>
+        <w:rPr>
+          <w:color w:val="000000" w:themeColor="text1"/>
+          <w:sz w:val="28"/>
+          <w:szCs w:val="28"/>
+          <w:lang w:val="en-US"/>
+        </w:rPr>
+        <w:t xml:space="preserve">Method:                           MLE   </w:t>
+      </w:r>
+      <w:proofErr w:type="spellStart"/>
+      <w:r>
+        <w:rPr>
+          <w:color w:val="000000" w:themeColor="text1"/>
+          <w:sz w:val="28"/>
+          <w:szCs w:val="28"/>
+          <w:lang w:val="en-US"/>
+        </w:rPr>
+        <w:t>Df</w:t>
+      </w:r>
+      <w:proofErr w:type="spellEnd"/>
+      <w:r>
+        <w:rPr>
+          <w:color w:val="000000" w:themeColor="text1"/>
+          <w:sz w:val="28"/>
+          <w:szCs w:val="28"/>
+          <w:lang w:val="en-US"/>
+        </w:rPr>
+        <w:t xml:space="preserve"> Model:                           10</w:t>
+      </w:r>
+    </w:p>
+    <w:p>
+      <w:pPr>
+        <w:rPr>
+          <w:color w:val="000000" w:themeColor="text1"/>
+          <w:sz w:val="28"/>
+          <w:szCs w:val="28"/>
+          <w:lang w:val="en-US"/>
+        </w:rPr>
+      </w:pPr>
+      <w:r>
+        <w:rPr>
+          <w:color w:val="000000" w:themeColor="text1"/>
+          <w:sz w:val="28"/>
+          <w:szCs w:val="28"/>
+          <w:lang w:val="en-US"/>
+        </w:rPr>
+        <w:t>Date:                Sat, 15 Nov 2025   Pseudo R-</w:t>
+      </w:r>
+      <w:proofErr w:type="spellStart"/>
+      <w:r>
+        <w:rPr>
+          <w:color w:val="000000" w:themeColor="text1"/>
+          <w:sz w:val="28"/>
+          <w:szCs w:val="28"/>
+          <w:lang w:val="en-US"/>
+        </w:rPr>
+        <w:t>squ</w:t>
+      </w:r>
+      <w:proofErr w:type="spellEnd"/>
+      <w:r>
+        <w:rPr>
+          <w:color w:val="000000" w:themeColor="text1"/>
+          <w:sz w:val="28"/>
+          <w:szCs w:val="28"/>
+          <w:lang w:val="en-US"/>
+        </w:rPr>
+        <w:t>.:                  0.1952</w:t>
+      </w:r>
+    </w:p>
+    <w:p>
+      <w:pPr>
+        <w:rPr>
+          <w:color w:val="000000" w:themeColor="text1"/>
+          <w:sz w:val="28"/>
+          <w:szCs w:val="28"/>
+          <w:lang w:val="en-US"/>
+        </w:rPr>
+      </w:pPr>
+      <w:r>
+        <w:rPr>
+          <w:color w:val="000000" w:themeColor="text1"/>
+          <w:sz w:val="28"/>
+          <w:szCs w:val="28"/>
+          <w:lang w:val="en-US"/>
+        </w:rPr>
+        <w:t>Time:                        01:25:36   Log-Likelihood:                -3365.7</w:t>
+      </w:r>
+    </w:p>
+    <w:p>
+      <w:pPr>
+        <w:rPr>
+          <w:color w:val="000000" w:themeColor="text1"/>
+          <w:sz w:val="28"/>
+          <w:szCs w:val="28"/>
+          <w:lang w:val="en-US"/>
+        </w:rPr>
+      </w:pPr>
+      <w:r>
+        <w:rPr>
+          <w:color w:val="000000" w:themeColor="text1"/>
+          <w:sz w:val="28"/>
+          <w:szCs w:val="28"/>
+          <w:lang w:val="en-US"/>
+        </w:rPr>
+        <w:t>converged:                       True   LL-Null:                       -4182.0</w:t>
+      </w:r>
+    </w:p>
+    <w:p>
+      <w:pPr>
+        <w:rPr>
+          <w:color w:val="000000" w:themeColor="text1"/>
+          <w:sz w:val="28"/>
+          <w:szCs w:val="28"/>
+          <w:lang w:val="en-US"/>
+        </w:rPr>
+      </w:pPr>
+      <w:r>
+        <w:rPr>
+          <w:color w:val="000000" w:themeColor="text1"/>
+          <w:sz w:val="28"/>
+          <w:szCs w:val="28"/>
+          <w:lang w:val="en-US"/>
+        </w:rPr>
+        <w:t xml:space="preserve">Covariance Type:            </w:t>
+      </w:r>
+      <w:proofErr w:type="spellStart"/>
+      <w:r>
+        <w:rPr>
+          <w:color w:val="000000" w:themeColor="text1"/>
+          <w:sz w:val="28"/>
+          <w:szCs w:val="28"/>
+          <w:lang w:val="en-US"/>
+        </w:rPr>
+        <w:t>nonrobust</w:t>
+      </w:r>
+      <w:proofErr w:type="spellEnd"/>
+      <w:r>
+        <w:rPr>
+          <w:color w:val="000000" w:themeColor="text1"/>
+          <w:sz w:val="28"/>
+          <w:szCs w:val="28"/>
+          <w:lang w:val="en-US"/>
+        </w:rPr>
+        <w:t xml:space="preserve">   LLR p-value:                     0.000</w:t>
+      </w:r>
+    </w:p>
+    <w:p>
+      <w:pPr>
+        <w:rPr>
+          <w:color w:val="000000" w:themeColor="text1"/>
+          <w:sz w:val="28"/>
+          <w:szCs w:val="28"/>
+          <w:lang w:val="en-US"/>
+        </w:rPr>
+      </w:pPr>
+      <w:r>
+        <w:rPr>
+          <w:color w:val="000000" w:themeColor="text1"/>
+          <w:sz w:val="28"/>
+          <w:szCs w:val="28"/>
+          <w:lang w:val="en-US"/>
+        </w:rPr>
+        <w:t>==================================================================================</w:t>
+      </w:r>
+    </w:p>
+    <w:p>
+      <w:pPr>
+        <w:rPr>
+          <w:color w:val="000000" w:themeColor="text1"/>
+          <w:sz w:val="28"/>
+          <w:szCs w:val="28"/>
+          <w:lang w:val="en-US"/>
+        </w:rPr>
+      </w:pPr>
+      <w:r>
+        <w:rPr>
+          <w:color w:val="000000" w:themeColor="text1"/>
+          <w:sz w:val="28"/>
+          <w:szCs w:val="28"/>
+          <w:lang w:val="en-US"/>
+        </w:rPr>
+        <w:t xml:space="preserve">                     </w:t>
+      </w:r>
+      <w:proofErr w:type="spellStart"/>
+      <w:r>
+        <w:rPr>
+          <w:color w:val="000000" w:themeColor="text1"/>
+          <w:sz w:val="28"/>
+          <w:szCs w:val="28"/>
+          <w:lang w:val="en-US"/>
+        </w:rPr>
+        <w:t>coef</w:t>
+      </w:r>
+      <w:proofErr w:type="spellEnd"/>
+      <w:r>
+        <w:rPr>
+          <w:color w:val="000000" w:themeColor="text1"/>
+          <w:sz w:val="28"/>
+          <w:szCs w:val="28"/>
+          <w:lang w:val="en-US"/>
+        </w:rPr>
+        <w:t xml:space="preserve">    std err          z      P&gt;|z|   </w:t>
+      </w:r>
+      <w:proofErr w:type="gramStart"/>
+      <w:r>
+        <w:rPr>
+          <w:color w:val="000000" w:themeColor="text1"/>
+          <w:sz w:val="28"/>
+          <w:szCs w:val="28"/>
+          <w:lang w:val="en-US"/>
+        </w:rPr>
+        <w:t xml:space="preserve">   [</w:t>
+      </w:r>
+      <w:proofErr w:type="gramEnd"/>
+      <w:r>
+        <w:rPr>
+          <w:color w:val="000000" w:themeColor="text1"/>
+          <w:sz w:val="28"/>
+          <w:szCs w:val="28"/>
+          <w:lang w:val="en-US"/>
+        </w:rPr>
+        <w:t>0.025      0.975]</w:t>
+      </w:r>
+    </w:p>
+    <w:p>
+      <w:pPr>
+        <w:rPr>
+          <w:color w:val="000000" w:themeColor="text1"/>
+          <w:sz w:val="28"/>
+          <w:szCs w:val="28"/>
+        </w:rPr>
+      </w:pPr>
+      <w:r>
+        <w:rPr>
+          <w:color w:val="000000" w:themeColor="text1"/>
+          <w:sz w:val="28"/>
+          <w:szCs w:val="28"/>
+        </w:rPr>
+        <w:t>----------------------------------------------------------------------------------</w:t>
+      </w:r>
+    </w:p>
+    <w:p>
+      <w:pPr>
+        <w:rPr>
+          <w:color w:val="000000" w:themeColor="text1"/>
+          <w:sz w:val="28"/>
+          <w:szCs w:val="28"/>
+        </w:rPr>
+      </w:pPr>
+      <w:proofErr w:type="spellStart"/>
+      <w:r>
+        <w:rPr>
+          <w:color w:val="000000" w:themeColor="text1"/>
+          <w:sz w:val="28"/>
+          <w:szCs w:val="28"/>
+        </w:rPr>
+        <w:t>const</w:t>
+      </w:r>
+      <w:proofErr w:type="spellEnd"/>
+      <w:r>
+        <w:rPr>
+          <w:color w:val="000000" w:themeColor="text1"/>
+          <w:sz w:val="28"/>
+          <w:szCs w:val="28"/>
+        </w:rPr>
+        <w:t xml:space="preserve">             -0.0455      0.461     -0.099      0.921      -0.950       0.858</w:t>
+      </w:r>
+    </w:p>
+    <w:p>
+      <w:pPr>
+        <w:rPr>
+          <w:color w:val="000000" w:themeColor="text1"/>
+          <w:sz w:val="28"/>
+          <w:szCs w:val="28"/>
+        </w:rPr>
+      </w:pPr>
+      <w:r>
+        <w:rPr>
+          <w:color w:val="000000" w:themeColor="text1"/>
+          <w:sz w:val="28"/>
+          <w:szCs w:val="28"/>
+        </w:rPr>
+        <w:t>ch06              -0.0049      0.002     -2.867      0.004      -0.008      -0.002</w:t>
+      </w:r>
+    </w:p>
+    <w:p>
+      <w:pPr>
+        <w:rPr>
+          <w:color w:val="000000" w:themeColor="text1"/>
+          <w:sz w:val="28"/>
+          <w:szCs w:val="28"/>
+        </w:rPr>
+      </w:pPr>
+      <w:proofErr w:type="spellStart"/>
+      <w:r>
+        <w:rPr>
+          <w:color w:val="000000" w:themeColor="text1"/>
+          <w:sz w:val="28"/>
+          <w:szCs w:val="28"/>
+        </w:rPr>
+        <w:t>nivel_ed</w:t>
+      </w:r>
+      <w:proofErr w:type="spellEnd"/>
+      <w:r>
+        <w:rPr>
+          <w:color w:val="000000" w:themeColor="text1"/>
+          <w:sz w:val="28"/>
+          <w:szCs w:val="28"/>
+        </w:rPr>
+        <w:t xml:space="preserve">          -0.1179      0.018     -6.377      0.000      -0.154      -0.082</w:t>
+      </w:r>
+    </w:p>
+    <w:p>
+      <w:pPr>
+        <w:rPr>
+          <w:color w:val="000000" w:themeColor="text1"/>
+          <w:sz w:val="28"/>
+          <w:szCs w:val="28"/>
+        </w:rPr>
+      </w:pPr>
+      <w:r>
+        <w:rPr>
+          <w:color w:val="000000" w:themeColor="text1"/>
+          <w:sz w:val="28"/>
+          <w:szCs w:val="28"/>
+        </w:rPr>
+        <w:t>estado             0.3367      0.038      8.810      0.000       0.262       0.412</w:t>
+      </w:r>
+    </w:p>
+    <w:p>
+      <w:pPr>
+        <w:rPr>
+          <w:color w:val="000000" w:themeColor="text1"/>
+          <w:sz w:val="28"/>
+          <w:szCs w:val="28"/>
+          <w:lang w:val="en-US"/>
+        </w:rPr>
+      </w:pPr>
+      <w:proofErr w:type="spellStart"/>
+      <w:r>
+        <w:rPr>
+          <w:color w:val="000000" w:themeColor="text1"/>
+          <w:sz w:val="28"/>
+          <w:szCs w:val="28"/>
+          <w:lang w:val="en-US"/>
+        </w:rPr>
+        <w:t>cat_inac</w:t>
+      </w:r>
+      <w:proofErr w:type="spellEnd"/>
+      <w:r>
+        <w:rPr>
+          <w:color w:val="000000" w:themeColor="text1"/>
+          <w:sz w:val="28"/>
+          <w:szCs w:val="28"/>
+          <w:lang w:val="en-US"/>
+        </w:rPr>
+        <w:t xml:space="preserve">           0.1377      0.032      4.273      0.000       0.075       0.201</w:t>
+      </w:r>
+    </w:p>
+    <w:p>
+      <w:pPr>
+        <w:rPr>
+          <w:color w:val="000000" w:themeColor="text1"/>
+          <w:sz w:val="28"/>
+          <w:szCs w:val="28"/>
+          <w:lang w:val="en-US"/>
+        </w:rPr>
+      </w:pPr>
+      <w:proofErr w:type="spellStart"/>
+      <w:r>
+        <w:rPr>
+          <w:color w:val="000000" w:themeColor="text1"/>
+          <w:sz w:val="28"/>
+          <w:szCs w:val="28"/>
+          <w:lang w:val="en-US"/>
+        </w:rPr>
+        <w:t>cat_ocup</w:t>
+      </w:r>
+      <w:proofErr w:type="spellEnd"/>
+      <w:r>
+        <w:rPr>
+          <w:color w:val="000000" w:themeColor="text1"/>
+          <w:sz w:val="28"/>
+          <w:szCs w:val="28"/>
+          <w:lang w:val="en-US"/>
+        </w:rPr>
+        <w:t xml:space="preserve">          -0.3178      0.087     -3.672      0.000      -0.487      -0.148</w:t>
+      </w:r>
+    </w:p>
+    <w:p>
+      <w:pPr>
+        <w:rPr>
+          <w:color w:val="000000" w:themeColor="text1"/>
+          <w:sz w:val="28"/>
+          <w:szCs w:val="28"/>
+          <w:lang w:val="en-US"/>
+        </w:rPr>
+      </w:pPr>
+      <w:r>
+        <w:rPr>
+          <w:color w:val="000000" w:themeColor="text1"/>
+          <w:sz w:val="28"/>
+          <w:szCs w:val="28"/>
+          <w:lang w:val="en-US"/>
+        </w:rPr>
+        <w:t>pp10a              0.3541      0.123      2.873      0.004       0.113       0.596</w:t>
+      </w:r>
+    </w:p>
+    <w:p>
+      <w:pPr>
+        <w:rPr>
+          <w:color w:val="000000" w:themeColor="text1"/>
+          <w:sz w:val="28"/>
+          <w:szCs w:val="28"/>
+        </w:rPr>
+      </w:pPr>
+      <w:r>
+        <w:rPr>
+          <w:color w:val="000000" w:themeColor="text1"/>
+          <w:sz w:val="28"/>
+          <w:szCs w:val="28"/>
+        </w:rPr>
+        <w:t>p21            -3.185e-06   1.94e-07    -16.456      0.000   -3.56e-06   -2.81e-06</w:t>
+      </w:r>
+    </w:p>
+    <w:p>
+      <w:pPr>
+        <w:rPr>
+          <w:color w:val="000000" w:themeColor="text1"/>
+          <w:sz w:val="28"/>
+          <w:szCs w:val="28"/>
+        </w:rPr>
+      </w:pPr>
+      <w:proofErr w:type="spellStart"/>
+      <w:r>
+        <w:rPr>
+          <w:color w:val="000000" w:themeColor="text1"/>
+          <w:sz w:val="28"/>
+          <w:szCs w:val="28"/>
+        </w:rPr>
+        <w:lastRenderedPageBreak/>
+        <w:t>t_vi</w:t>
+      </w:r>
+      <w:proofErr w:type="spellEnd"/>
+      <w:r>
+        <w:rPr>
+          <w:color w:val="000000" w:themeColor="text1"/>
+          <w:sz w:val="28"/>
+          <w:szCs w:val="28"/>
+        </w:rPr>
+        <w:t xml:space="preserve">           -4.209e-06    3.6e-07    -11.699      0.000   -4.91e-06    -3.5e-06</w:t>
+      </w:r>
+    </w:p>
+    <w:p>
+      <w:pPr>
+        <w:rPr>
+          <w:color w:val="000000" w:themeColor="text1"/>
+          <w:sz w:val="28"/>
+          <w:szCs w:val="28"/>
+        </w:rPr>
+      </w:pPr>
+      <w:proofErr w:type="spellStart"/>
+      <w:r>
+        <w:rPr>
+          <w:color w:val="000000" w:themeColor="text1"/>
+          <w:sz w:val="28"/>
+          <w:szCs w:val="28"/>
+        </w:rPr>
+        <w:t>adulto_esquiv</w:t>
+      </w:r>
+      <w:proofErr w:type="spellEnd"/>
+      <w:r>
+        <w:rPr>
+          <w:color w:val="000000" w:themeColor="text1"/>
+          <w:sz w:val="28"/>
+          <w:szCs w:val="28"/>
+        </w:rPr>
+        <w:t xml:space="preserve">      1.5170      0.243      6.241      0.000       1.041       1.993</w:t>
+      </w:r>
+    </w:p>
+    <w:p>
+      <w:pPr>
+        <w:rPr>
+          <w:color w:val="000000" w:themeColor="text1"/>
+          <w:sz w:val="28"/>
+          <w:szCs w:val="28"/>
+        </w:rPr>
+      </w:pPr>
+      <w:proofErr w:type="spellStart"/>
+      <w:r>
+        <w:rPr>
+          <w:color w:val="000000" w:themeColor="text1"/>
+          <w:sz w:val="28"/>
+          <w:szCs w:val="28"/>
+        </w:rPr>
+        <w:t>ad_equiv_hogar</w:t>
+      </w:r>
+      <w:proofErr w:type="spellEnd"/>
+      <w:r>
+        <w:rPr>
+          <w:color w:val="000000" w:themeColor="text1"/>
+          <w:sz w:val="28"/>
+          <w:szCs w:val="28"/>
+        </w:rPr>
+        <w:t xml:space="preserve">     0.3200      0.021     15.321      0.000       0.279       0.361</w:t>
+      </w:r>
+    </w:p>
+    <w:p>
+      <w:pPr>
+        <w:rPr>
+          <w:color w:val="000000" w:themeColor="text1"/>
+          <w:sz w:val="28"/>
+          <w:szCs w:val="28"/>
+        </w:rPr>
+      </w:pPr>
+    </w:p>
+    <w:p>
+      <w:pPr>
+        <w:rPr>
+          <w:color w:val="000000" w:themeColor="text1"/>
+          <w:sz w:val="28"/>
+          <w:szCs w:val="28"/>
+        </w:rPr>
+      </w:pPr>
+      <w:r>
+        <w:rPr>
+          <w:color w:val="000000" w:themeColor="text1"/>
+          <w:sz w:val="28"/>
+          <w:szCs w:val="28"/>
+        </w:rPr>
+        <w:t>Consigna 4</w:t>
+      </w:r>
+    </w:p>
+    <w:p>
+      <w:pPr>
+        <w:jc w:val="both"/>
+        <w:rPr>
+          <w:color w:val="000000" w:themeColor="text1"/>
+          <w:sz w:val="28"/>
+          <w:szCs w:val="28"/>
+        </w:rPr>
+      </w:pPr>
+      <w:r>
+        <w:rPr>
+          <w:color w:val="000000" w:themeColor="text1"/>
+          <w:sz w:val="28"/>
+          <w:szCs w:val="28"/>
+        </w:rPr>
+        <w:t>El gráfico muestra la relación estimada entre el nivel educativo y la probabilidad de ser pobre durante el año 2025, manteniendo constantes el resto de las características sociodemográficas y laborales del individuo en su valor promedio. La pendiente negativa es clara y pronunciada: conforme aumenta el nivel educativo, la probabilidad predicha de ser pobre cae de manera consistente. Para los individuos con los niveles educativos más bajos, la probabilidad estimada de ser pobres se ubica cercana al 47%, mientras que para aquellos que alcanzan los niveles más altos del sistema educativo, dicha probabilidad desciende a alrededor del 30%. Esto confirma que la educación actúa como un determinante estructural de la vulnerabilidad económica, reduciendo significativamente el riesgo de pobreza incluso cuando se controla por otras variables relevantes.</w:t>
+      </w:r>
+    </w:p>
+    <w:p>
+      <w:pPr>
+        <w:jc w:val="both"/>
+        <w:rPr>
+          <w:color w:val="000000" w:themeColor="text1"/>
+          <w:sz w:val="28"/>
+          <w:szCs w:val="28"/>
+        </w:rPr>
+      </w:pPr>
+      <w:r>
+        <w:rPr>
+          <w:color w:val="000000" w:themeColor="text1"/>
+          <w:sz w:val="28"/>
+          <w:szCs w:val="28"/>
+        </w:rPr>
+        <w:t>Este comportamiento es coherente con la teoría del capital humano y con los resultados previos del modelo logístico: mayores niveles de educación suelen asociarse con mejores oportunidades en el mercado laboral, mayor estabilidad ocupacional y acceso a empleos de mayor productividad. El modelo captura esta relación al mostrar que el efecto marginal de la educación es fuerte y robusto, y que las diferencias entre niveles educativos se traducen en diferencias sustanciales en la probabilidad de pobreza. En síntesis, el gráfico permite visualizar de manera intuitiva cómo el aumento en el nivel educativo constituye un mecanismo clave para reducir la vulnerabilidad económica dentro de la población analizada.</w:t>
+      </w:r>
+    </w:p>
+    <w:p>
+      <w:pPr>
+        <w:rPr>
+          <w:color w:val="000000" w:themeColor="text1"/>
+          <w:sz w:val="28"/>
+          <w:szCs w:val="28"/>
+        </w:rPr>
+      </w:pPr>
+      <w:r>
+        <w:rPr>
+          <w:color w:val="000000" w:themeColor="text1"/>
+          <w:sz w:val="28"/>
+          <w:szCs w:val="28"/>
+        </w:rPr>
+        <w:lastRenderedPageBreak/>
+        <w:drawing>
+          <wp:inline distT="0" distB="0" distL="0" distR="0" wp14:anchorId="3679F6BB" wp14:editId="3EDF68C7">
+            <wp:extent cx="5731510" cy="3622040"/>
+            <wp:effectExtent l="0" t="0" r="2540" b="0"/>
+            <wp:docPr id="1796251695" name="Imagen 1" descr="Gráfico, Gráfico de líneas&#10;&#10;El contenido generado por IA puede ser incorrecto."/>
+            <wp:cNvGraphicFramePr>
+              <a:graphicFrameLocks xmlns:a="http://schemas.openxmlformats.org/drawingml/2006/main" noChangeAspect="1"/>
+            </wp:cNvGraphicFramePr>
+            <a:graphic xmlns:a="http://schemas.openxmlformats.org/drawingml/2006/main">
+              <a:graphicData uri="http://schemas.openxmlformats.org/drawingml/2006/picture">
+                <pic:pic xmlns:pic="http://schemas.openxmlformats.org/drawingml/2006/picture">
+                  <pic:nvPicPr>
+                    <pic:cNvPr id="1796251695" name="Imagen 1" descr="Gráfico, Gráfico de líneas&#10;&#10;El contenido generado por IA puede ser incorrecto."/>
+                    <pic:cNvPicPr/>
+                  </pic:nvPicPr>
+                  <pic:blipFill>
+                    <a:blip r:embed="rId8"/>
+                    <a:stretch>
+                      <a:fillRect/>
+                    </a:stretch>
+                  </pic:blipFill>
+                  <pic:spPr>
+                    <a:xfrm>
+                      <a:off x="0" y="0"/>
+                      <a:ext cx="5731510" cy="3622040"/>
+                    </a:xfrm>
+                    <a:prstGeom prst="rect">
+                      <a:avLst/>
+                    </a:prstGeom>
+                  </pic:spPr>
+                </pic:pic>
+              </a:graphicData>
+            </a:graphic>
+          </wp:inline>
+        </w:drawing>
+      </w:r>
     </w:p>
     <w:sectPr>
-      <w:headerReference w:type="default" r:id="rId8"/>
-      <w:footerReference w:type="default" r:id="rId9"/>
+      <w:headerReference w:type="default" r:id="rId9"/>
+      <w:footerReference w:type="default" r:id="rId10"/>
       <w:pgSz w:w="11906" w:h="16838"/>
       <w:pgMar w:top="1440" w:right="1440" w:bottom="1440" w:left="1440" w:header="708" w:footer="708" w:gutter="0"/>
       <w:cols w:space="708"/>
@@ -1073,7 +2719,6 @@
   <w:style w:type="character" w:default="1" w:styleId="Fuentedeprrafopredeter">
     <w:name w:val="Default Paragraph Font"/>
     <w:uiPriority w:val="1"/>
-    <w:semiHidden/>
     <w:unhideWhenUsed/>
   </w:style>
   <w:style w:type="table" w:default="1" w:styleId="Tablanormal">

</xml_diff>